<commit_message>
A2 units 1-10: rebuild both volumes after the listening fix
The ten-unit Student Book (205pp) and Answer Key (28pp), DOCX and PDF,
rebuilt so the files carry the withheld columns rather than the tables that
printed their own answers. Document checks 9/9 and 5/5.

Co-Authored-By: Claude Opus 5 <noreply@anthropic.com>
Claude-Session: https://claude.ai/code/session_014CXxgwgFGq3U1n3hdRyQYX
</commit_message>
<xml_diff>
--- a/docs/general-english/A2/build/EFDL-A2-AnswerKey-u01-10.docx
+++ b/docs/general-english/A2/build/EFDL-A2-AnswerKey-u01-10.docx
@@ -1073,13 +1073,13 @@
         <w:t xml:space="preserve"> </w:t>
       </w:r>
       <w:r>
-        <w:t xml:space="preserve">0 she started a course (example) · 1 a hotel · 2 she taught English ·</w:t>
-      </w:r>
-      <w:r>
-        <w:t xml:space="preserve"> </w:t>
-      </w:r>
-      <w:r>
-        <w:t xml:space="preserve">3 June</w:t>
+        <w:t xml:space="preserve">0 she started a course (example) · 1 she worked at the desk ·</w:t>
+      </w:r>
+      <w:r>
+        <w:t xml:space="preserve"> </w:t>
+      </w:r>
+      <w:r>
+        <w:t xml:space="preserve">2 she taught English · 3 she came home</w:t>
       </w:r>
     </w:p>
     <w:p>
@@ -1992,7 +1992,7 @@
         <w:t xml:space="preserve"> </w:t>
       </w:r>
       <w:r>
-        <w:t xml:space="preserve">2 he counted the money · 3 Marek</w:t>
+        <w:t xml:space="preserve">2 he counted the money · 3 he locked the door</w:t>
       </w:r>
     </w:p>
     <w:p>
@@ -2901,7 +2901,7 @@
         <w:t xml:space="preserve"> </w:t>
       </w:r>
       <w:r>
-        <w:t xml:space="preserve">0 flat 11 (example) · 1 June · 2 flat 4 · 3 flat 9</w:t>
+        <w:t xml:space="preserve">0 flat 11 (example) · 1 furnished · 2 flat 4 · 3 flat 9</w:t>
       </w:r>
     </w:p>
     <w:p>
@@ -3804,7 +3804,7 @@
         <w:t xml:space="preserve"> </w:t>
       </w:r>
       <w:r>
-        <w:t xml:space="preserve">0 600 (example) · 1 180 · 2 Rosa · 3 Lili</w:t>
+        <w:t xml:space="preserve">0 600 (example) · 1 180 · 2 140 · 3 72</w:t>
       </w:r>
     </w:p>
     <w:p>
@@ -3823,7 +3823,7 @@
         <w:t xml:space="preserve"> </w:t>
       </w:r>
       <w:r>
-        <w:t xml:space="preserve">0 1.80 (example) · 1 2.90 · 2 large · 3 2.20</w:t>
+        <w:t xml:space="preserve">0 1.80 (example) · 1 2.90 · 2 large · 3 2.60</w:t>
       </w:r>
     </w:p>
     <w:p>
@@ -4753,13 +4753,13 @@
         <w:t xml:space="preserve"> </w:t>
       </w:r>
       <w:r>
-        <w:t xml:space="preserve">0 at the shop door (example) · 1 she saw Rosa fall · 2 outside ·</w:t>
-      </w:r>
-      <w:r>
-        <w:t xml:space="preserve"> </w:t>
-      </w:r>
-      <w:r>
-        <w:t xml:space="preserve">3 Nadia</w:t>
+        <w:t xml:space="preserve">0 at the shop door (example) · 1 she saw Rosa fall ·</w:t>
+      </w:r>
+      <w:r>
+        <w:t xml:space="preserve"> </w:t>
+      </w:r>
+      <w:r>
+        <w:t xml:space="preserve">2 the ambulance · 3 Nadia</w:t>
       </w:r>
     </w:p>
     <w:p>
@@ -7546,7 +7546,7 @@
         <w:t xml:space="preserve"> </w:t>
       </w:r>
       <w:r>
-        <w:t xml:space="preserve">0 A. Silva (example) · 1 10.15 · 2 driver · 3 room 4</w:t>
+        <w:t xml:space="preserve">0 A. Silva (example) · 1 assistant · 2 driver · 3 room 4</w:t>
       </w:r>
     </w:p>
     <w:p>
@@ -7565,7 +7565,7 @@
         <w:t xml:space="preserve"> </w:t>
       </w:r>
       <w:r>
-        <w:t xml:space="preserve">0 a badge (example) · 1 smoke · 2 wash their hands · 3 the oil</w:t>
+        <w:t xml:space="preserve">0 a badge (example) · 1 smoke · 2 their hair · 3 the oil</w:t>
       </w:r>
     </w:p>
     <w:p>

</xml_diff>